<commit_message>
fixed up to 5
</commit_message>
<xml_diff>
--- a/docs/activities/lecture_05/05_class_activity.docx
+++ b/docs/activities/lecture_05/05_class_activity.docx
@@ -7,7 +7,15 @@
         <w:pStyle w:val="Title"/>
       </w:pPr>
       <w:r>
-        <w:t xml:space="preserve">05_Class_Activity Regressions</w:t>
+        <w:t xml:space="preserve">Worksheet 05 — Linear Regression</w:t>
+      </w:r>
+    </w:p>
+    <w:p>
+      <w:pPr>
+        <w:pStyle w:val="Subtitle"/>
+      </w:pPr>
+      <w:r>
+        <w:t xml:space="preserve">Building a calibration curve to predict leaf area from paper tracing mass</w:t>
       </w:r>
     </w:p>
     <w:p>
@@ -6279,7 +6287,13 @@
         <w:t xml:space="preserve"> </w:t>
       </w:r>
       <w:r>
-        <w:t xml:space="preserve">- What the regression tested - F-statistic, df₁, df₂, and p-value (from the F-statistic line in</w:t>
+        <w:t xml:space="preserve">- What the regression tested</w:t>
+      </w:r>
+      <w:r>
+        <w:t xml:space="preserve"> </w:t>
+      </w:r>
+      <w:r>
+        <w:t xml:space="preserve">- F-statistic, df₁, df₂, and p-value (from the F-statistic line in</w:t>
       </w:r>
       <w:r>
         <w:t xml:space="preserve"> </w:t>
@@ -6291,7 +6305,25 @@
         <w:t xml:space="preserve">summary()</w:t>
       </w:r>
       <w:r>
-        <w:t xml:space="preserve">) - R² - The calibration equation (slope and intercept) - 95% confidence interval for the slope (use</w:t>
+        <w:t xml:space="preserve">)</w:t>
+      </w:r>
+      <w:r>
+        <w:t xml:space="preserve"> </w:t>
+      </w:r>
+      <w:r>
+        <w:t xml:space="preserve">- R²</w:t>
+      </w:r>
+      <w:r>
+        <w:t xml:space="preserve"> </w:t>
+      </w:r>
+      <w:r>
+        <w:t xml:space="preserve">- The calibration equation (slope and intercept)</w:t>
+      </w:r>
+      <w:r>
+        <w:t xml:space="preserve"> </w:t>
+      </w:r>
+      <w:r>
+        <w:t xml:space="preserve">- 95% confidence interval for the slope (use</w:t>
       </w:r>
       <w:r>
         <w:t xml:space="preserve"> </w:t>
@@ -6303,7 +6335,13 @@
         <w:t xml:space="preserve">confint(paper_lm_model)</w:t>
       </w:r>
       <w:r>
-        <w:t xml:space="preserve">) - Brief mention of assumption checks</w:t>
+        <w:t xml:space="preserve">)</w:t>
+      </w:r>
+      <w:r>
+        <w:t xml:space="preserve"> </w:t>
+      </w:r>
+      <w:r>
+        <w:t xml:space="preserve">- Brief mention of assumption checks</w:t>
       </w:r>
     </w:p>
     <w:p>

</xml_diff>